<commit_message>
Refresh submission documents and map
Co-Authored-By: Claude Opus 5.5 <noreply@anthropic.com>
</commit_message>
<xml_diff>
--- a/docs/Aangan_Desk_Study_Guide.docx
+++ b/docs/Aangan_Desk_Study_Guide.docx
@@ -168,6 +168,30 @@
       </w:pPr>
       <w:r>
         <w:t>Guardrail: A safety rule that stops the AI doing something it must never do. Ours stops any price being spoken.</w:t>
+      </w:r>
+    </w:p>
+    <w:p>
+      <w:pPr>
+        <w:pStyle w:val="Heading1"/>
+      </w:pPr>
+      <w:r>
+        <w:t>2b. The real voice agent (Vaani) and WebRTC</w:t>
+      </w:r>
+    </w:p>
+    <w:p>
+      <w:r>
+        <w:rPr>
+          <w:b w:val="0"/>
+        </w:rPr>
+        <w:t>Vaani is a voice-AI platform. On it we created an AGENT called aangan-receptionist: the worker that listens and speaks on calls, using our instructions (Nikhil's rules and the no-price rule). WebRTC is the technology that carries live voice through a web browser over the internet, the same idea as a WhatsApp or Google Meet call, so no phone line is needed. On our Live AI call page, pressing Start asks Vaani for a secure session and connects your microphone to the agent. The agent can also phone a number (outbound). When a call ends, Vaani sends us a WEBHOOK message with the transcript, a summary, a recording link and quality scores; our code then decides the outcome and updates Telegram, HubSpot, the database and the dashboard.</w:t>
+      </w:r>
+    </w:p>
+    <w:p>
+      <w:r>
+        <w:rPr>
+          <w:b w:val="0"/>
+        </w:rPr>
+        <w:t>How we verified it: we made real WebRTC calls to the agent using a synthetic Indian-English caller voice played into the browser as its microphone. Four calls are on the dashboard: a qualified 2BHK in Baner (price refused), an out-of-area caller from Nashik (closed politely), an angry existing client (escalated), and a caller whose area was not caught (correctly sent to call-back instead of being forwarded). Outbound dialling reached Vaani; it blocks numbers on India's Do-Not-Disturb registry, as required by TRAI.</w:t>
       </w:r>
     </w:p>
     <w:p>
@@ -727,6 +751,54 @@
         <w:rPr>
           <w:b/>
         </w:rPr>
+        <w:t>Q: Is it a real voice agent or a chatbot?</w:t>
+      </w:r>
+    </w:p>
+    <w:p>
+      <w:r>
+        <w:rPr>
+          <w:b w:val="0"/>
+        </w:rPr>
+        <w:t>A: Real. It is a Vaani voice agent. You talk to it over WebRTC from the Live AI call page, or it phones a number. Every call's transcript, summary and recording link come back to our dashboard automatically.</w:t>
+      </w:r>
+    </w:p>
+    <w:p>
+      <w:r>
+        <w:rPr>
+          <w:b/>
+        </w:rPr>
+        <w:t>Q: What is WebRTC?</w:t>
+      </w:r>
+    </w:p>
+    <w:p>
+      <w:r>
+        <w:rPr>
+          <w:b w:val="0"/>
+        </w:rPr>
+        <w:t>A: The standard way browsers carry live audio and video over the internet (used by Google Meet). It lets anyone test the agent without a phone number.</w:t>
+      </w:r>
+    </w:p>
+    <w:p>
+      <w:r>
+        <w:rPr>
+          <w:b/>
+        </w:rPr>
+        <w:t>Q: Can you start a live call to a number?</w:t>
+      </w:r>
+    </w:p>
+    <w:p>
+      <w:r>
+        <w:rPr>
+          <w:b w:val="0"/>
+        </w:rPr>
+        <w:t>A: Yes: type it on the Live AI call page. Vaani dials it within seconds. Numbers on the DND registry are blocked by law.</w:t>
+      </w:r>
+    </w:p>
+    <w:p>
+      <w:r>
+        <w:rPr>
+          <w:b/>
+        </w:rPr>
         <w:t>Q: Can I see it working?</w:t>
       </w:r>
     </w:p>
@@ -735,7 +807,7 @@
         <w:rPr>
           <w:b w:val="0"/>
         </w:rPr>
-        <w:t>A: Open the live app, press "Qualified home", then show the dashboard, the Telegram message and the HubSpot contact.</w:t>
+        <w:t>A: Open the Live AI call page, press Start live call and speak; then open the dashboard to see the transcript, takeaways and decision.</w:t>
       </w:r>
     </w:p>
     <w:p>

</xml_diff>